<commit_message>
feat: ship launch skill FX system and harden deep breath secrecy
Add data-driven skill effect profiles with tiered anchors, wire the client FX manager and gallery verification, and keep deep breath secret from leaking to opponents.

Co-authored-by: Cursor <cursoragent@cursor.com>
</commit_message>
<xml_diff>
--- a/docs/超限德州-技能系统现行规则.docx
+++ b/docs/超限德州-技能系统现行规则.docx
@@ -5454,7 +5454,7 @@
                 <w:color w:val="1A243A"/>
                 <w:sz w:val="18"/>
               </w:rPr>
-              <w:t>公开</w:t>
+              <w:t>秘密</w:t>
             </w:r>
           </w:p>
         </w:tc>
@@ -11559,7 +11559,7 @@
           <w:color w:val="4A5260"/>
           <w:sz w:val="20"/>
         </w:rPr>
-        <w:t>负载 1  ·  费用 1  ·  主动  ·  每手 1 次</w:t>
+        <w:t>负载 1  ·  费用 1  ·  主动 / 秘密  ·  每手 1 次</w:t>
       </w:r>
     </w:p>
     <w:p>
@@ -11623,7 +11623,23 @@
           <w:color w:val="1A243A"/>
           <w:sz w:val="21"/>
         </w:rPr>
-        <w:t>• 可被反制。公平抑制其结束恢复。</w:t>
+        <w:t>• 可被反制。若被合法阻止，回收利用按 floor(1 × 50%) = 0 结算，不实际返还能量。</w:t>
+      </w:r>
+    </w:p>
+    <w:p>
+      <w:pPr>
+        <w:spacing w:before="20" w:after="40" w:line="340" w:lineRule="exact"/>
+        <w:ind w:left="425" w:hanging="255"/>
+      </w:pPr>
+      <w:r>
+        <w:rPr>
+          <w:rFonts w:ascii="微软雅黑" w:hAnsi="微软雅黑" w:eastAsia="微软雅黑"/>
+          <w:b w:val="0"/>
+          <w:i w:val="0"/>
+          <w:color w:val="1A243A"/>
+          <w:sz w:val="21"/>
+        </w:rPr>
+        <w:t>• 公平清除待恢复状态并抑制本手结束恢复。</w:t>
       </w:r>
     </w:p>
     <w:p>

</xml_diff>